<commit_message>
Sprint 1: Se agrega la seccion de responsabilidades de las clases al documento
</commit_message>
<xml_diff>
--- a/Sprint_0_TPI_Programacion_II.docx
+++ b/Sprint_0_TPI_Programacion_II.docx
@@ -3756,6 +3756,491 @@
       </w:r>
       <w:bookmarkStart w:id="0" w:name="_GoBack"/>
       <w:bookmarkEnd w:id="0"/>
+    </w:p>
+    <w:p>
+      <w:pPr>
+        <w:rPr>
+          <w:rFonts w:ascii="Calibri" w:hAnsi="Calibri"/>
+        </w:rPr>
+      </w:pPr>
+    </w:p>
+    <w:p>
+      <w:pPr>
+        <w:pStyle w:val="Ttulo1"/>
+        <w:numPr>
+          <w:ilvl w:val="0"/>
+          <w:numId w:val="0"/>
+        </w:numPr>
+        <w:spacing w:before="280" w:after="80"/>
+        <w:jc w:val="left"/>
+        <w:rPr>
+          <w:b/>
+          <w:bCs/>
+        </w:rPr>
+      </w:pPr>
+      <w:r>
+        <w:rPr>
+          <w:rFonts w:ascii="Calibri" w:hAnsi="Calibri"/>
+          <w:b/>
+        </w:rPr>
+        <w:t xml:space="preserve">Responsabilidades de las clases</w:t>
+      </w:r>
+    </w:p>
+    <w:p>
+      <w:pPr>
+        <w:spacing w:after="80"/>
+      </w:pPr>
+      <w:r>
+        <w:rPr>
+          <w:rFonts w:ascii="Calibri" w:hAnsi="Calibri"/>
+        </w:rPr>
+        <w:t xml:space="preserve">Siguiendo el principio de Responsabilidad Única (SRP - Single Responsibility Principle) de la programación orientada a objetos, cada clase del sistema asume un conjunto delimitado y coherente de responsabilidades dentro del modelo de dominio:</w:t>
+      </w:r>
+    </w:p>
+    <w:p>
+      <w:pPr>
+        <w:spacing w:before="160" w:after="60"/>
+      </w:pPr>
+      <w:r>
+        <w:rPr>
+          <w:rFonts w:ascii="Calibri" w:hAnsi="Calibri"/>
+          <w:b/>
+          <w:i/>
+          <w:sz w:val="22"/>
+        </w:rPr>
+        <w:t xml:space="preserve">1. Cliente</w:t>
+      </w:r>
+    </w:p>
+    <w:p>
+      <w:pPr>
+        <w:ind w:left="360" w:hanging="180"/>
+        <w:spacing w:after="60"/>
+      </w:pPr>
+      <w:r>
+        <w:rPr>
+          <w:rFonts w:ascii="Calibri" w:hAnsi="Calibri"/>
+        </w:rPr>
+        <w:t xml:space="preserve">• </w:t>
+      </w:r>
+      <w:r>
+        <w:rPr>
+          <w:rFonts w:ascii="Calibri" w:hAnsi="Calibri"/>
+          <w:b/>
+        </w:rPr>
+        <w:t xml:space="preserve">Representación del titular: </w:t>
+      </w:r>
+      <w:r>
+        <w:rPr>
+          <w:rFonts w:ascii="Calibri" w:hAnsi="Calibri"/>
+        </w:rPr>
+        <w:t xml:space="preserve">Modela a la persona responsable y titular de contacto ante la clínica veterinaria (dueño de una o más mascotas).</w:t>
+      </w:r>
+    </w:p>
+    <w:p>
+      <w:pPr>
+        <w:ind w:left="360" w:hanging="180"/>
+        <w:spacing w:after="60"/>
+      </w:pPr>
+      <w:r>
+        <w:rPr>
+          <w:rFonts w:ascii="Calibri" w:hAnsi="Calibri"/>
+        </w:rPr>
+        <w:t xml:space="preserve">• </w:t>
+      </w:r>
+      <w:r>
+        <w:rPr>
+          <w:rFonts w:ascii="Calibri" w:hAnsi="Calibri"/>
+          <w:b/>
+        </w:rPr>
+        <w:t xml:space="preserve">Gestión de identidad y contacto: </w:t>
+      </w:r>
+      <w:r>
+        <w:rPr>
+          <w:rFonts w:ascii="Calibri" w:hAnsi="Calibri"/>
+        </w:rPr>
+        <w:t xml:space="preserve">Almacena y encapsula sus atributos personales (id, nombre, apellido, teléfono).</w:t>
+      </w:r>
+    </w:p>
+    <w:p>
+      <w:pPr>
+        <w:ind w:left="360" w:hanging="180"/>
+        <w:spacing w:after="60"/>
+      </w:pPr>
+      <w:r>
+        <w:rPr>
+          <w:rFonts w:ascii="Calibri" w:hAnsi="Calibri"/>
+        </w:rPr>
+        <w:t xml:space="preserve">• </w:t>
+      </w:r>
+      <w:r>
+        <w:rPr>
+          <w:rFonts w:ascii="Calibri" w:hAnsi="Calibri"/>
+          <w:b/>
+        </w:rPr>
+        <w:t xml:space="preserve">Administración de mascotas: </w:t>
+      </w:r>
+      <w:r>
+        <w:rPr>
+          <w:rFonts w:ascii="Calibri" w:hAnsi="Calibri"/>
+        </w:rPr>
+        <w:t xml:space="preserve">Mantiene la colección de mascotas a su cargo (List&lt;Mascota&gt;) y proporciona el método agregarMascota(Mascota) para incorporar nuevos animales sin delegar esta lógica a agentes externos.</w:t>
+      </w:r>
+    </w:p>
+    <w:p>
+      <w:pPr>
+        <w:spacing w:before="160" w:after="60"/>
+      </w:pPr>
+      <w:r>
+        <w:rPr>
+          <w:rFonts w:ascii="Calibri" w:hAnsi="Calibri"/>
+          <w:b/>
+          <w:i/>
+          <w:sz w:val="22"/>
+        </w:rPr>
+        <w:t xml:space="preserve">2. Mascota</w:t>
+      </w:r>
+    </w:p>
+    <w:p>
+      <w:pPr>
+        <w:ind w:left="360" w:hanging="180"/>
+        <w:spacing w:after="60"/>
+      </w:pPr>
+      <w:r>
+        <w:rPr>
+          <w:rFonts w:ascii="Calibri" w:hAnsi="Calibri"/>
+        </w:rPr>
+        <w:t xml:space="preserve">• </w:t>
+      </w:r>
+      <w:r>
+        <w:rPr>
+          <w:rFonts w:ascii="Calibri" w:hAnsi="Calibri"/>
+          <w:b/>
+        </w:rPr>
+        <w:t xml:space="preserve">Representación del paciente: </w:t>
+      </w:r>
+      <w:r>
+        <w:rPr>
+          <w:rFonts w:ascii="Calibri" w:hAnsi="Calibri"/>
+        </w:rPr>
+        <w:t xml:space="preserve">Modela al animal que recibe los cuidados médicos y servicios dentro de la veterinaria.</w:t>
+      </w:r>
+    </w:p>
+    <w:p>
+      <w:pPr>
+        <w:ind w:left="360" w:hanging="180"/>
+        <w:spacing w:after="60"/>
+      </w:pPr>
+      <w:r>
+        <w:rPr>
+          <w:rFonts w:ascii="Calibri" w:hAnsi="Calibri"/>
+        </w:rPr>
+        <w:t xml:space="preserve">• </w:t>
+      </w:r>
+      <w:r>
+        <w:rPr>
+          <w:rFonts w:ascii="Calibri" w:hAnsi="Calibri"/>
+          <w:b/>
+        </w:rPr>
+        <w:t xml:space="preserve">Encapsulamiento biológico: </w:t>
+      </w:r>
+      <w:r>
+        <w:rPr>
+          <w:rFonts w:ascii="Calibri" w:hAnsi="Calibri"/>
+        </w:rPr>
+        <w:t xml:space="preserve">Resguarda la identidad y características del animal (id, nombre, especie, raza).</w:t>
+      </w:r>
+    </w:p>
+    <w:p>
+      <w:pPr>
+        <w:ind w:left="360" w:hanging="180"/>
+        <w:spacing w:after="60"/>
+      </w:pPr>
+      <w:r>
+        <w:rPr>
+          <w:rFonts w:ascii="Calibri" w:hAnsi="Calibri"/>
+        </w:rPr>
+        <w:t xml:space="preserve">• </w:t>
+      </w:r>
+      <w:r>
+        <w:rPr>
+          <w:rFonts w:ascii="Calibri" w:hAnsi="Calibri"/>
+          <w:b/>
+        </w:rPr>
+        <w:t xml:space="preserve">Entidad individual de turnos: </w:t>
+      </w:r>
+      <w:r>
+        <w:rPr>
+          <w:rFonts w:ascii="Calibri" w:hAnsi="Calibri"/>
+        </w:rPr>
+        <w:t xml:space="preserve">Funciona como el sujeto central e individual sobre el cual se agendan los turnos, respetando la regla de negocio de que cada turno corresponde a una única mascota.</w:t>
+      </w:r>
+    </w:p>
+    <w:p>
+      <w:pPr>
+        <w:spacing w:before="160" w:after="60"/>
+      </w:pPr>
+      <w:r>
+        <w:rPr>
+          <w:rFonts w:ascii="Calibri" w:hAnsi="Calibri"/>
+          <w:b/>
+          <w:i/>
+          <w:sz w:val="22"/>
+        </w:rPr>
+        <w:t xml:space="preserve">3. Profesional</w:t>
+      </w:r>
+    </w:p>
+    <w:p>
+      <w:pPr>
+        <w:ind w:left="360" w:hanging="180"/>
+        <w:spacing w:after="60"/>
+      </w:pPr>
+      <w:r>
+        <w:rPr>
+          <w:rFonts w:ascii="Calibri" w:hAnsi="Calibri"/>
+        </w:rPr>
+        <w:t xml:space="preserve">• </w:t>
+      </w:r>
+      <w:r>
+        <w:rPr>
+          <w:rFonts w:ascii="Calibri" w:hAnsi="Calibri"/>
+          <w:b/>
+        </w:rPr>
+        <w:t xml:space="preserve">Representación del personal médico: </w:t>
+      </w:r>
+      <w:r>
+        <w:rPr>
+          <w:rFonts w:ascii="Calibri" w:hAnsi="Calibri"/>
+        </w:rPr>
+        <w:t xml:space="preserve">Modela al veterinario o especialista habilitado para prestar los servicios de la clínica.</w:t>
+      </w:r>
+    </w:p>
+    <w:p>
+      <w:pPr>
+        <w:ind w:left="360" w:hanging="180"/>
+        <w:spacing w:after="60"/>
+      </w:pPr>
+      <w:r>
+        <w:rPr>
+          <w:rFonts w:ascii="Calibri" w:hAnsi="Calibri"/>
+        </w:rPr>
+        <w:t xml:space="preserve">• </w:t>
+      </w:r>
+      <w:r>
+        <w:rPr>
+          <w:rFonts w:ascii="Calibri" w:hAnsi="Calibri"/>
+          <w:b/>
+        </w:rPr>
+        <w:t xml:space="preserve">Identificación y especialidad: </w:t>
+      </w:r>
+      <w:r>
+        <w:rPr>
+          <w:rFonts w:ascii="Calibri" w:hAnsi="Calibri"/>
+        </w:rPr>
+        <w:t xml:space="preserve">Encapsula su número de matrícula profesional, sus datos de contacto (teléfono, correo) y su especialidad médica correspondiente.</w:t>
+      </w:r>
+    </w:p>
+    <w:p>
+      <w:pPr>
+        <w:ind w:left="360" w:hanging="180"/>
+        <w:spacing w:after="60"/>
+      </w:pPr>
+      <w:r>
+        <w:rPr>
+          <w:rFonts w:ascii="Calibri" w:hAnsi="Calibri"/>
+        </w:rPr>
+        <w:t xml:space="preserve">• </w:t>
+      </w:r>
+      <w:r>
+        <w:rPr>
+          <w:rFonts w:ascii="Calibri" w:hAnsi="Calibri"/>
+          <w:b/>
+        </w:rPr>
+        <w:t xml:space="preserve">Validación de atención y disponibilidad: </w:t>
+      </w:r>
+      <w:r>
+        <w:rPr>
+          <w:rFonts w:ascii="Calibri" w:hAnsi="Calibri"/>
+        </w:rPr>
+        <w:t xml:space="preserve">Provee la información esencial para contrastar su especialidad frente a los servicios solicitados y controlar que no existan superposiciones horarias en su agenda.</w:t>
+      </w:r>
+    </w:p>
+    <w:p>
+      <w:pPr>
+        <w:spacing w:before="160" w:after="60"/>
+      </w:pPr>
+      <w:r>
+        <w:rPr>
+          <w:rFonts w:ascii="Calibri" w:hAnsi="Calibri"/>
+          <w:b/>
+          <w:i/>
+          <w:sz w:val="22"/>
+        </w:rPr>
+        <w:t xml:space="preserve">4. Servicio</w:t>
+      </w:r>
+    </w:p>
+    <w:p>
+      <w:pPr>
+        <w:ind w:left="360" w:hanging="180"/>
+        <w:spacing w:after="60"/>
+      </w:pPr>
+      <w:r>
+        <w:rPr>
+          <w:rFonts w:ascii="Calibri" w:hAnsi="Calibri"/>
+        </w:rPr>
+        <w:t xml:space="preserve">• </w:t>
+      </w:r>
+      <w:r>
+        <w:rPr>
+          <w:rFonts w:ascii="Calibri" w:hAnsi="Calibri"/>
+          <w:b/>
+        </w:rPr>
+        <w:t xml:space="preserve">Tipificación de prestaciones: </w:t>
+      </w:r>
+      <w:r>
+        <w:rPr>
+          <w:rFonts w:ascii="Calibri" w:hAnsi="Calibri"/>
+        </w:rPr>
+        <w:t xml:space="preserve">Modela el catálogo de servicios ofrecidos por la veterinaria (consulta general, cirugía, vacunación, etc.).</w:t>
+      </w:r>
+    </w:p>
+    <w:p>
+      <w:pPr>
+        <w:ind w:left="360" w:hanging="180"/>
+        <w:spacing w:after="60"/>
+      </w:pPr>
+      <w:r>
+        <w:rPr>
+          <w:rFonts w:ascii="Calibri" w:hAnsi="Calibri"/>
+        </w:rPr>
+        <w:t xml:space="preserve">• </w:t>
+      </w:r>
+      <w:r>
+        <w:rPr>
+          <w:rFonts w:ascii="Calibri" w:hAnsi="Calibri"/>
+          <w:b/>
+        </w:rPr>
+        <w:t xml:space="preserve">Requerimientos de habilitación: </w:t>
+      </w:r>
+      <w:r>
+        <w:rPr>
+          <w:rFonts w:ascii="Calibri" w:hAnsi="Calibri"/>
+        </w:rPr>
+        <w:t xml:space="preserve">Encapsula la lista de especialidades requeridas (List&lt;String&gt; especialidadRequerida) necesarias para prestar la atención.</w:t>
+      </w:r>
+    </w:p>
+    <w:p>
+      <w:pPr>
+        <w:ind w:left="360" w:hanging="180"/>
+        <w:spacing w:after="60"/>
+      </w:pPr>
+      <w:r>
+        <w:rPr>
+          <w:rFonts w:ascii="Calibri" w:hAnsi="Calibri"/>
+        </w:rPr>
+        <w:t xml:space="preserve">• </w:t>
+      </w:r>
+      <w:r>
+        <w:rPr>
+          <w:rFonts w:ascii="Calibri" w:hAnsi="Calibri"/>
+          <w:b/>
+        </w:rPr>
+        <w:t xml:space="preserve">Desacoplamiento de reglas: </w:t>
+      </w:r>
+      <w:r>
+        <w:rPr>
+          <w:rFonts w:ascii="Calibri" w:hAnsi="Calibri"/>
+        </w:rPr>
+        <w:t xml:space="preserve">Permite desacoplar el servicio de los profesionales específicos, funcionando como criterio de validación al momento de asignar un turno.</w:t>
+      </w:r>
+    </w:p>
+    <w:p>
+      <w:pPr>
+        <w:spacing w:before="160" w:after="60"/>
+      </w:pPr>
+      <w:r>
+        <w:rPr>
+          <w:rFonts w:ascii="Calibri" w:hAnsi="Calibri"/>
+          <w:b/>
+          <w:i/>
+          <w:sz w:val="22"/>
+        </w:rPr>
+        <w:t xml:space="preserve">5. Turno</w:t>
+      </w:r>
+    </w:p>
+    <w:p>
+      <w:pPr>
+        <w:ind w:left="360" w:hanging="180"/>
+        <w:spacing w:after="60"/>
+      </w:pPr>
+      <w:r>
+        <w:rPr>
+          <w:rFonts w:ascii="Calibri" w:hAnsi="Calibri"/>
+        </w:rPr>
+        <w:t xml:space="preserve">• </w:t>
+      </w:r>
+      <w:r>
+        <w:rPr>
+          <w:rFonts w:ascii="Calibri" w:hAnsi="Calibri"/>
+          <w:b/>
+        </w:rPr>
+        <w:t xml:space="preserve">Objeto asociativo central: </w:t>
+      </w:r>
+      <w:r>
+        <w:rPr>
+          <w:rFonts w:ascii="Calibri" w:hAnsi="Calibri"/>
+        </w:rPr>
+        <w:t xml:space="preserve">Materializa la reserva concreta de un horario determinado, vinculando a una Mascota, un Profesional y un Servicio solicitado.</w:t>
+      </w:r>
+    </w:p>
+    <w:p>
+      <w:pPr>
+        <w:ind w:left="360" w:hanging="180"/>
+        <w:spacing w:after="60"/>
+      </w:pPr>
+      <w:r>
+        <w:rPr>
+          <w:rFonts w:ascii="Calibri" w:hAnsi="Calibri"/>
+        </w:rPr>
+        <w:t xml:space="preserve">• </w:t>
+      </w:r>
+      <w:r>
+        <w:rPr>
+          <w:rFonts w:ascii="Calibri" w:hAnsi="Calibri"/>
+          <w:b/>
+        </w:rPr>
+        <w:t xml:space="preserve">Control de datos temporales: </w:t>
+      </w:r>
+      <w:r>
+        <w:rPr>
+          <w:rFonts w:ascii="Calibri" w:hAnsi="Calibri"/>
+        </w:rPr>
+        <w:t xml:space="preserve">Registra y preserva la fecha y hora de la cita veterinaria.</w:t>
+      </w:r>
+    </w:p>
+    <w:p>
+      <w:pPr>
+        <w:ind w:left="360" w:hanging="180"/>
+        <w:spacing w:after="60"/>
+      </w:pPr>
+      <w:r>
+        <w:rPr>
+          <w:rFonts w:ascii="Calibri" w:hAnsi="Calibri"/>
+        </w:rPr>
+        <w:t xml:space="preserve">• </w:t>
+      </w:r>
+      <w:r>
+        <w:rPr>
+          <w:rFonts w:ascii="Calibri" w:hAnsi="Calibri"/>
+          <w:b/>
+        </w:rPr>
+        <w:t xml:space="preserve">Gestión de ciclo de vida y estado: </w:t>
+      </w:r>
+      <w:r>
+        <w:rPr>
+          <w:rFonts w:ascii="Calibri" w:hAnsi="Calibri"/>
+        </w:rPr>
+        <w:t xml:space="preserve">Controla si el turno se encuentra activo o cancelado (atributo boolean cancelado), permitiendo gestionar cancelaciones según los límites de tiempo de la veterinaria.</w:t>
+      </w:r>
     </w:p>
     <w:sectPr>
       <w:type w:val="nextPage"/>

</xml_diff>

<commit_message>
Sprint 1: agrega la sección Decisiones de diseño al documento
</commit_message>
<xml_diff>
--- a/Sprint_0_TPI_Programacion_II.docx
+++ b/Sprint_0_TPI_Programacion_II.docx
@@ -3758,11 +3758,9 @@
       <w:bookmarkEnd w:id="0"/>
     </w:p>
     <w:p>
-      <w:pPr>
-        <w:rPr>
-          <w:rFonts w:ascii="Calibri" w:hAnsi="Calibri"/>
-        </w:rPr>
-      </w:pPr>
+      <w:r>
+        <w:br w:type="page"/>
+      </w:r>
     </w:p>
     <w:p>
       <w:pPr>
@@ -3771,7 +3769,7 @@
           <w:ilvl w:val="0"/>
           <w:numId w:val="0"/>
         </w:numPr>
-        <w:spacing w:before="280" w:after="80"/>
+        <w:spacing w:after="80"/>
         <w:jc w:val="left"/>
         <w:rPr>
           <w:b/>
@@ -3783,24 +3781,25 @@
           <w:rFonts w:ascii="Calibri" w:hAnsi="Calibri"/>
           <w:b/>
         </w:rPr>
-        <w:t xml:space="preserve">Responsabilidades de las clases</w:t>
-      </w:r>
-    </w:p>
-    <w:p>
-      <w:pPr>
-        <w:spacing w:after="80"/>
-      </w:pPr>
+        <w:t xml:space="preserve">Decisiones de diseño</w:t>
+      </w:r>
+    </w:p>
+    <w:p>
       <w:r>
         <w:rPr>
           <w:rFonts w:ascii="Calibri" w:hAnsi="Calibri"/>
         </w:rPr>
-        <w:t xml:space="preserve">Siguiendo el principio de Responsabilidad Única (SRP - Single Responsibility Principle) de la programación orientada a objetos, cada clase del sistema asume un conjunto delimitado y coherente de responsabilidades dentro del modelo de dominio:</w:t>
-      </w:r>
-    </w:p>
-    <w:p>
-      <w:pPr>
-        <w:spacing w:before="160" w:after="60"/>
-      </w:pPr>
+        <w:t xml:space="preserve">Acá explicamos qué decidimos al pasar del boceto del Sprint 0 al código, y por qué.</w:t>
+      </w:r>
+    </w:p>
+    <w:p>
+      <w:pPr>
+        <w:rPr>
+          <w:rFonts w:ascii="Calibri" w:hAnsi="Calibri"/>
+        </w:rPr>
+      </w:pPr>
+    </w:p>
+    <w:p>
       <w:r>
         <w:rPr>
           <w:rFonts w:ascii="Calibri" w:hAnsi="Calibri"/>
@@ -3808,88 +3807,340 @@
           <w:i/>
           <w:sz w:val="22"/>
         </w:rPr>
-        <w:t xml:space="preserve">1. Cliente</w:t>
-      </w:r>
-    </w:p>
-    <w:p>
-      <w:pPr>
-        <w:ind w:left="360" w:hanging="180"/>
-        <w:spacing w:after="60"/>
-      </w:pPr>
+        <w:t xml:space="preserve">Qué cambió a comparacion  del Sprint 0</w:t>
+      </w:r>
+    </w:p>
+    <w:p/>
+    <w:p>
       <w:r>
         <w:rPr>
           <w:rFonts w:ascii="Calibri" w:hAnsi="Calibri"/>
         </w:rPr>
-        <w:t xml:space="preserve">• </w:t>
-      </w:r>
-      <w:r>
+        <w:t xml:space="preserve"> cambiamos algunas cosas del boceto:</w:t>
+      </w:r>
+    </w:p>
+    <w:tbl>
+      <w:tblPr>
+        <w:tblStyle w:val="TableGrid"/>
+        <w:tblW w:w="9360" w:type="dxa"/>
+        <w:tblLook w:val="04A0" w:firstRow="1" w:lastRow="0" w:firstColumn="1" w:lastColumn="0" w:noHBand="0" w:noVBand="1"/>
+      </w:tblPr>
+      <w:tblGrid>
+        <w:gridCol w:w="1400"/>
+        <w:gridCol w:w="2300"/>
+        <w:gridCol w:w="2700"/>
+        <w:gridCol w:w="2960"/>
+      </w:tblGrid>
+      <w:tr>
+        <w:trPr>
+          <w:tblHeader/>
+        </w:trPr>
+        <w:tc>
+          <w:tcPr>
+            <w:tcW w:w="1400" w:type="dxa"/>
+            <w:shd w:val="clear" w:color="auto" w:fill="2F5496"/>
+          </w:tcPr>
+          <w:p>
+            <w:r>
+              <w:rPr>
+                <w:rFonts w:ascii="Calibri" w:hAnsi="Calibri"/>
+                <w:b/>
+                <w:color w:val="FFFFFF"/>
+              </w:rPr>
+              <w:t xml:space="preserve">Clase</w:t>
+            </w:r>
+          </w:p>
+        </w:tc>
+        <w:tc>
+          <w:tcPr>
+            <w:tcW w:w="2300" w:type="dxa"/>
+            <w:shd w:val="clear" w:color="auto" w:fill="2F5496"/>
+          </w:tcPr>
+          <w:p>
+            <w:r>
+              <w:rPr>
+                <w:rFonts w:ascii="Calibri" w:hAnsi="Calibri"/>
+                <w:b/>
+                <w:color w:val="FFFFFF"/>
+              </w:rPr>
+              <w:t xml:space="preserve">Antes (Sprint 0)</w:t>
+            </w:r>
+          </w:p>
+        </w:tc>
+        <w:tc>
+          <w:tcPr>
+            <w:tcW w:w="2700" w:type="dxa"/>
+            <w:shd w:val="clear" w:color="auto" w:fill="2F5496"/>
+          </w:tcPr>
+          <w:p>
+            <w:r>
+              <w:rPr>
+                <w:rFonts w:ascii="Calibri" w:hAnsi="Calibri"/>
+                <w:b/>
+                <w:color w:val="FFFFFF"/>
+              </w:rPr>
+              <w:t xml:space="preserve">Ahora (código)</w:t>
+            </w:r>
+          </w:p>
+        </w:tc>
+        <w:tc>
+          <w:tcPr>
+            <w:tcW w:w="2960" w:type="dxa"/>
+            <w:shd w:val="clear" w:color="auto" w:fill="2F5496"/>
+          </w:tcPr>
+          <w:p>
+            <w:r>
+              <w:rPr>
+                <w:rFonts w:ascii="Calibri" w:hAnsi="Calibri"/>
+                <w:b/>
+                <w:color w:val="FFFFFF"/>
+              </w:rPr>
+              <w:t xml:space="preserve">Por qué</w:t>
+            </w:r>
+          </w:p>
+        </w:tc>
+      </w:tr>
+      <w:tr>
+        <w:tc>
+          <w:tcPr>
+            <w:tcW w:w="1400" w:type="dxa"/>
+          </w:tcPr>
+          <w:p>
+            <w:r>
+              <w:rPr>
+                <w:rFonts w:ascii="Calibri" w:hAnsi="Calibri"/>
+                <w:color w:val="000000"/>
+              </w:rPr>
+              <w:t xml:space="preserve">Mascota</w:t>
+            </w:r>
+          </w:p>
+        </w:tc>
+        <w:tc>
+          <w:tcPr>
+            <w:tcW w:w="2300" w:type="dxa"/>
+          </w:tcPr>
+          <w:p>
+            <w:r>
+              <w:rPr>
+                <w:rFonts w:ascii="Calibri" w:hAnsi="Calibri"/>
+                <w:color w:val="000000"/>
+              </w:rPr>
+              <w:t xml:space="preserve">animal</w:t>
+            </w:r>
+          </w:p>
+        </w:tc>
+        <w:tc>
+          <w:tcPr>
+            <w:tcW w:w="2700" w:type="dxa"/>
+          </w:tcPr>
+          <w:p>
+            <w:r>
+              <w:rPr>
+                <w:rFonts w:ascii="Calibri" w:hAnsi="Calibri"/>
+                <w:color w:val="000000"/>
+              </w:rPr>
+              <w:t xml:space="preserve">especie y raza</w:t>
+            </w:r>
+          </w:p>
+        </w:tc>
+        <w:tc>
+          <w:tcPr>
+            <w:tcW w:w="2960" w:type="dxa"/>
+          </w:tcPr>
+          <w:p>
+            <w:r>
+              <w:rPr>
+                <w:rFonts w:ascii="Calibri" w:hAnsi="Calibri"/>
+                <w:color w:val="000000"/>
+              </w:rPr>
+              <w:t xml:space="preserve">“Especie” es la palabra correcta y la raza le sirve al veterinario</w:t>
+            </w:r>
+          </w:p>
+        </w:tc>
+      </w:tr>
+      <w:tr>
+        <w:tc>
+          <w:tcPr>
+            <w:tcW w:w="1400" w:type="dxa"/>
+          </w:tcPr>
+          <w:p>
+            <w:r>
+              <w:rPr>
+                <w:rFonts w:ascii="Calibri" w:hAnsi="Calibri"/>
+                <w:color w:val="000000"/>
+              </w:rPr>
+              <w:t xml:space="preserve">Mascota</w:t>
+            </w:r>
+          </w:p>
+        </w:tc>
+        <w:tc>
+          <w:tcPr>
+            <w:tcW w:w="2300" w:type="dxa"/>
+          </w:tcPr>
+          <w:p>
+            <w:r>
+              <w:rPr>
+                <w:rFonts w:ascii="Calibri" w:hAnsi="Calibri"/>
+                <w:color w:val="000000"/>
+              </w:rPr>
+              <w:t xml:space="preserve">dueño</w:t>
+            </w:r>
+          </w:p>
+        </w:tc>
+        <w:tc>
+          <w:tcPr>
+            <w:tcW w:w="2700" w:type="dxa"/>
+          </w:tcPr>
+          <w:p>
+            <w:r>
+              <w:rPr>
+                <w:rFonts w:ascii="Calibri" w:hAnsi="Calibri"/>
+                <w:color w:val="000000"/>
+              </w:rPr>
+              <w:t xml:space="preserve">Se sacó</w:t>
+            </w:r>
+          </w:p>
+        </w:tc>
+        <w:tc>
+          <w:tcPr>
+            <w:tcW w:w="2960" w:type="dxa"/>
+          </w:tcPr>
+          <w:p>
+            <w:r>
+              <w:rPr>
+                <w:rFonts w:ascii="Calibri" w:hAnsi="Calibri"/>
+                <w:color w:val="000000"/>
+              </w:rPr>
+              <w:t xml:space="preserve">El cliente ya sabe cuáles son sus mascotas</w:t>
+            </w:r>
+          </w:p>
+        </w:tc>
+      </w:tr>
+      <w:tr>
+        <w:tc>
+          <w:tcPr>
+            <w:tcW w:w="1400" w:type="dxa"/>
+          </w:tcPr>
+          <w:p>
+            <w:r>
+              <w:rPr>
+                <w:rFonts w:ascii="Calibri" w:hAnsi="Calibri"/>
+                <w:color w:val="000000"/>
+              </w:rPr>
+              <w:t xml:space="preserve">Profesional</w:t>
+            </w:r>
+          </w:p>
+        </w:tc>
+        <w:tc>
+          <w:tcPr>
+            <w:tcW w:w="2300" w:type="dxa"/>
+          </w:tcPr>
+          <w:p>
+            <w:r>
+              <w:rPr>
+                <w:rFonts w:ascii="Calibri" w:hAnsi="Calibri"/>
+                <w:color w:val="000000"/>
+              </w:rPr>
+              <w:t xml:space="preserve">horarios</w:t>
+            </w:r>
+          </w:p>
+        </w:tc>
+        <w:tc>
+          <w:tcPr>
+            <w:tcW w:w="2700" w:type="dxa"/>
+          </w:tcPr>
+          <w:p>
+            <w:r>
+              <w:rPr>
+                <w:rFonts w:ascii="Calibri" w:hAnsi="Calibri"/>
+                <w:color w:val="000000"/>
+              </w:rPr>
+              <w:t xml:space="preserve">Todavía no está</w:t>
+            </w:r>
+          </w:p>
+        </w:tc>
+        <w:tc>
+          <w:tcPr>
+            <w:tcW w:w="2960" w:type="dxa"/>
+          </w:tcPr>
+          <w:p>
+            <w:r>
+              <w:rPr>
+                <w:rFonts w:ascii="Calibri" w:hAnsi="Calibri"/>
+                <w:color w:val="000000"/>
+              </w:rPr>
+              <w:t xml:space="preserve">Lo vamos a agregar cuando programemos la disponibilidad horaria</w:t>
+            </w:r>
+          </w:p>
+        </w:tc>
+      </w:tr>
+      <w:tr>
+        <w:tc>
+          <w:tcPr>
+            <w:tcW w:w="1400" w:type="dxa"/>
+          </w:tcPr>
+          <w:p>
+            <w:r>
+              <w:rPr>
+                <w:rFonts w:ascii="Calibri" w:hAnsi="Calibri"/>
+                <w:color w:val="000000"/>
+              </w:rPr>
+              <w:t xml:space="preserve">Turno</w:t>
+            </w:r>
+          </w:p>
+        </w:tc>
+        <w:tc>
+          <w:tcPr>
+            <w:tcW w:w="2300" w:type="dxa"/>
+          </w:tcPr>
+          <w:p>
+            <w:r>
+              <w:rPr>
+                <w:rFonts w:ascii="Calibri" w:hAnsi="Calibri"/>
+                <w:color w:val="000000"/>
+              </w:rPr>
+              <w:t xml:space="preserve">horario</w:t>
+            </w:r>
+          </w:p>
+        </w:tc>
+        <w:tc>
+          <w:tcPr>
+            <w:tcW w:w="2700" w:type="dxa"/>
+          </w:tcPr>
+          <w:p>
+            <w:r>
+              <w:rPr>
+                <w:rFonts w:ascii="Calibri" w:hAnsi="Calibri"/>
+                <w:color w:val="000000"/>
+              </w:rPr>
+              <w:t xml:space="preserve">fecha y horario</w:t>
+            </w:r>
+          </w:p>
+        </w:tc>
+        <w:tc>
+          <w:tcPr>
+            <w:tcW w:w="2960" w:type="dxa"/>
+          </w:tcPr>
+          <w:p>
+            <w:r>
+              <w:rPr>
+                <w:rFonts w:ascii="Calibri" w:hAnsi="Calibri"/>
+                <w:color w:val="000000"/>
+              </w:rPr>
+              <w:t xml:space="preserve">Es más fácil buscar los turnos de un día</w:t>
+            </w:r>
+          </w:p>
+        </w:tc>
+      </w:tr>
+    </w:tbl>
+    <w:p>
+      <w:pPr>
         <w:rPr>
           <w:rFonts w:ascii="Calibri" w:hAnsi="Calibri"/>
-          <w:b/>
-        </w:rPr>
-        <w:t xml:space="preserve">Representación del titular: </w:t>
-      </w:r>
-      <w:r>
-        <w:rPr>
-          <w:rFonts w:ascii="Calibri" w:hAnsi="Calibri"/>
-        </w:rPr>
-        <w:t xml:space="preserve">Modela a la persona responsable y titular de contacto ante la clínica veterinaria (dueño de una o más mascotas).</w:t>
-      </w:r>
-    </w:p>
-    <w:p>
-      <w:pPr>
-        <w:ind w:left="360" w:hanging="180"/>
-        <w:spacing w:after="60"/>
-      </w:pPr>
-      <w:r>
-        <w:rPr>
-          <w:rFonts w:ascii="Calibri" w:hAnsi="Calibri"/>
-        </w:rPr>
-        <w:t xml:space="preserve">• </w:t>
-      </w:r>
-      <w:r>
-        <w:rPr>
-          <w:rFonts w:ascii="Calibri" w:hAnsi="Calibri"/>
-          <w:b/>
-        </w:rPr>
-        <w:t xml:space="preserve">Gestión de identidad y contacto: </w:t>
-      </w:r>
-      <w:r>
-        <w:rPr>
-          <w:rFonts w:ascii="Calibri" w:hAnsi="Calibri"/>
-        </w:rPr>
-        <w:t xml:space="preserve">Almacena y encapsula sus atributos personales (id, nombre, apellido, teléfono).</w:t>
-      </w:r>
-    </w:p>
-    <w:p>
-      <w:pPr>
-        <w:ind w:left="360" w:hanging="180"/>
-        <w:spacing w:after="60"/>
-      </w:pPr>
-      <w:r>
-        <w:rPr>
-          <w:rFonts w:ascii="Calibri" w:hAnsi="Calibri"/>
-        </w:rPr>
-        <w:t xml:space="preserve">• </w:t>
-      </w:r>
-      <w:r>
-        <w:rPr>
-          <w:rFonts w:ascii="Calibri" w:hAnsi="Calibri"/>
-          <w:b/>
-        </w:rPr>
-        <w:t xml:space="preserve">Administración de mascotas: </w:t>
-      </w:r>
-      <w:r>
-        <w:rPr>
-          <w:rFonts w:ascii="Calibri" w:hAnsi="Calibri"/>
-        </w:rPr>
-        <w:t xml:space="preserve">Mantiene la colección de mascotas a su cargo (List&lt;Mascota&gt;) y proporciona el método agregarMascota(Mascota) para incorporar nuevos animales sin delegar esta lógica a agentes externos.</w:t>
-      </w:r>
-    </w:p>
-    <w:p>
-      <w:pPr>
-        <w:spacing w:before="160" w:after="60"/>
-      </w:pPr>
+        </w:rPr>
+      </w:pPr>
+    </w:p>
+    <w:p>
       <w:r>
         <w:rPr>
           <w:rFonts w:ascii="Calibri" w:hAnsi="Calibri"/>
@@ -3897,88 +4148,33 @@
           <w:i/>
           <w:sz w:val="22"/>
         </w:rPr>
-        <w:t xml:space="preserve">2. Mascota</w:t>
-      </w:r>
-    </w:p>
-    <w:p>
-      <w:pPr>
-        <w:ind w:left="360" w:hanging="180"/>
-        <w:spacing w:after="60"/>
-      </w:pPr>
+        <w:t xml:space="preserve">1. Los datos de cada clase están protegidos</w:t>
+      </w:r>
+    </w:p>
+    <w:p>
       <w:r>
         <w:rPr>
           <w:rFonts w:ascii="Calibri" w:hAnsi="Calibri"/>
         </w:rPr>
-        <w:t xml:space="preserve">• </w:t>
-      </w:r>
+        <w:t xml:space="preserve">Todos los atributos son private. Desde afuera solo se pueden leer con los métodos get. No hay métodos set para cambiarlos.</w:t>
+      </w:r>
+    </w:p>
+    <w:p>
       <w:r>
         <w:rPr>
           <w:rFonts w:ascii="Calibri" w:hAnsi="Calibri"/>
-          <w:b/>
-        </w:rPr>
-        <w:t xml:space="preserve">Representación del paciente: </w:t>
-      </w:r>
-      <w:r>
+        </w:rPr>
+        <w:t xml:space="preserve">Lo hicimos así para que nadie cambie un dato por error. Por ejemplo: si cualquiera pudiera cambiar el profesional de un turno, se podría poner a alguien que no tiene la especialidad necesaria. Cuando algo sí tiene que cambiar, usamos un método con un nombre claro, como agregarMascota() en Cliente.</w:t>
+      </w:r>
+    </w:p>
+    <w:p>
+      <w:pPr>
         <w:rPr>
           <w:rFonts w:ascii="Calibri" w:hAnsi="Calibri"/>
         </w:rPr>
-        <w:t xml:space="preserve">Modela al animal que recibe los cuidados médicos y servicios dentro de la veterinaria.</w:t>
-      </w:r>
-    </w:p>
-    <w:p>
-      <w:pPr>
-        <w:ind w:left="360" w:hanging="180"/>
-        <w:spacing w:after="60"/>
-      </w:pPr>
-      <w:r>
-        <w:rPr>
-          <w:rFonts w:ascii="Calibri" w:hAnsi="Calibri"/>
-        </w:rPr>
-        <w:t xml:space="preserve">• </w:t>
-      </w:r>
-      <w:r>
-        <w:rPr>
-          <w:rFonts w:ascii="Calibri" w:hAnsi="Calibri"/>
-          <w:b/>
-        </w:rPr>
-        <w:t xml:space="preserve">Encapsulamiento biológico: </w:t>
-      </w:r>
-      <w:r>
-        <w:rPr>
-          <w:rFonts w:ascii="Calibri" w:hAnsi="Calibri"/>
-        </w:rPr>
-        <w:t xml:space="preserve">Resguarda la identidad y características del animal (id, nombre, especie, raza).</w:t>
-      </w:r>
-    </w:p>
-    <w:p>
-      <w:pPr>
-        <w:ind w:left="360" w:hanging="180"/>
-        <w:spacing w:after="60"/>
-      </w:pPr>
-      <w:r>
-        <w:rPr>
-          <w:rFonts w:ascii="Calibri" w:hAnsi="Calibri"/>
-        </w:rPr>
-        <w:t xml:space="preserve">• </w:t>
-      </w:r>
-      <w:r>
-        <w:rPr>
-          <w:rFonts w:ascii="Calibri" w:hAnsi="Calibri"/>
-          <w:b/>
-        </w:rPr>
-        <w:t xml:space="preserve">Entidad individual de turnos: </w:t>
-      </w:r>
-      <w:r>
-        <w:rPr>
-          <w:rFonts w:ascii="Calibri" w:hAnsi="Calibri"/>
-        </w:rPr>
-        <w:t xml:space="preserve">Funciona como el sujeto central e individual sobre el cual se agendan los turnos, respetando la regla de negocio de que cada turno corresponde a una única mascota.</w:t>
-      </w:r>
-    </w:p>
-    <w:p>
-      <w:pPr>
-        <w:spacing w:before="160" w:after="60"/>
-      </w:pPr>
+      </w:pPr>
+    </w:p>
+    <w:p>
       <w:r>
         <w:rPr>
           <w:rFonts w:ascii="Calibri" w:hAnsi="Calibri"/>
@@ -3986,88 +4182,33 @@
           <w:i/>
           <w:sz w:val="22"/>
         </w:rPr>
-        <w:t xml:space="preserve">3. Profesional</w:t>
-      </w:r>
-    </w:p>
-    <w:p>
-      <w:pPr>
-        <w:ind w:left="360" w:hanging="180"/>
-        <w:spacing w:after="60"/>
-      </w:pPr>
+        <w:t xml:space="preserve">2. Cada objeto tiene su número (id)</w:t>
+      </w:r>
+    </w:p>
+    <w:p>
       <w:r>
         <w:rPr>
           <w:rFonts w:ascii="Calibri" w:hAnsi="Calibri"/>
         </w:rPr>
-        <w:t xml:space="preserve">• </w:t>
-      </w:r>
+        <w:t xml:space="preserve">Cliente, Mascota, Servicio y Turno tienen un id. Sirve para no confundir dos cosas que se llaman igual, por ejemplo dos perros llamados “Firulais”.</w:t>
+      </w:r>
+    </w:p>
+    <w:p>
       <w:r>
         <w:rPr>
           <w:rFonts w:ascii="Calibri" w:hAnsi="Calibri"/>
-          <w:b/>
-        </w:rPr>
-        <w:t xml:space="preserve">Representación del personal médico: </w:t>
-      </w:r>
-      <w:r>
+        </w:rPr>
+        <w:t xml:space="preserve">El profesional no tiene id porque usa su matricula, que ya es un número único de cada veterinario.</w:t>
+      </w:r>
+    </w:p>
+    <w:p>
+      <w:pPr>
         <w:rPr>
           <w:rFonts w:ascii="Calibri" w:hAnsi="Calibri"/>
         </w:rPr>
-        <w:t xml:space="preserve">Modela al veterinario o especialista habilitado para prestar los servicios de la clínica.</w:t>
-      </w:r>
-    </w:p>
-    <w:p>
-      <w:pPr>
-        <w:ind w:left="360" w:hanging="180"/>
-        <w:spacing w:after="60"/>
-      </w:pPr>
-      <w:r>
-        <w:rPr>
-          <w:rFonts w:ascii="Calibri" w:hAnsi="Calibri"/>
-        </w:rPr>
-        <w:t xml:space="preserve">• </w:t>
-      </w:r>
-      <w:r>
-        <w:rPr>
-          <w:rFonts w:ascii="Calibri" w:hAnsi="Calibri"/>
-          <w:b/>
-        </w:rPr>
-        <w:t xml:space="preserve">Identificación y especialidad: </w:t>
-      </w:r>
-      <w:r>
-        <w:rPr>
-          <w:rFonts w:ascii="Calibri" w:hAnsi="Calibri"/>
-        </w:rPr>
-        <w:t xml:space="preserve">Encapsula su número de matrícula profesional, sus datos de contacto (teléfono, correo) y su especialidad médica correspondiente.</w:t>
-      </w:r>
-    </w:p>
-    <w:p>
-      <w:pPr>
-        <w:ind w:left="360" w:hanging="180"/>
-        <w:spacing w:after="60"/>
-      </w:pPr>
-      <w:r>
-        <w:rPr>
-          <w:rFonts w:ascii="Calibri" w:hAnsi="Calibri"/>
-        </w:rPr>
-        <w:t xml:space="preserve">• </w:t>
-      </w:r>
-      <w:r>
-        <w:rPr>
-          <w:rFonts w:ascii="Calibri" w:hAnsi="Calibri"/>
-          <w:b/>
-        </w:rPr>
-        <w:t xml:space="preserve">Validación de atención y disponibilidad: </w:t>
-      </w:r>
-      <w:r>
-        <w:rPr>
-          <w:rFonts w:ascii="Calibri" w:hAnsi="Calibri"/>
-        </w:rPr>
-        <w:t xml:space="preserve">Provee la información esencial para contrastar su especialidad frente a los servicios solicitados y controlar que no existan superposiciones horarias en su agenda.</w:t>
-      </w:r>
-    </w:p>
-    <w:p>
-      <w:pPr>
-        <w:spacing w:before="160" w:after="60"/>
-      </w:pPr>
+      </w:pPr>
+    </w:p>
+    <w:p>
       <w:r>
         <w:rPr>
           <w:rFonts w:ascii="Calibri" w:hAnsi="Calibri"/>
@@ -4075,88 +4216,33 @@
           <w:i/>
           <w:sz w:val="22"/>
         </w:rPr>
-        <w:t xml:space="preserve">4. Servicio</w:t>
-      </w:r>
-    </w:p>
-    <w:p>
-      <w:pPr>
-        <w:ind w:left="360" w:hanging="180"/>
-        <w:spacing w:after="60"/>
-      </w:pPr>
+        <w:t xml:space="preserve">3. Mascota</w:t>
+      </w:r>
+    </w:p>
+    <w:p>
       <w:r>
         <w:rPr>
           <w:rFonts w:ascii="Calibri" w:hAnsi="Calibri"/>
         </w:rPr>
-        <w:t xml:space="preserve">• </w:t>
-      </w:r>
+        <w:t xml:space="preserve">Cambiamos animal por especie (perro, gato, etc.), que es la palabra correcta, y agregamos raza porque es un dato que el veterinario necesita.</w:t>
+      </w:r>
+    </w:p>
+    <w:p>
       <w:r>
         <w:rPr>
           <w:rFonts w:ascii="Calibri" w:hAnsi="Calibri"/>
-          <w:b/>
-        </w:rPr>
-        <w:t xml:space="preserve">Tipificación de prestaciones: </w:t>
-      </w:r>
-      <w:r>
+        </w:rPr>
+        <w:t xml:space="preserve">Sacamos el atributo dueño. El cliente ya tiene la lista de sus mascotas, así que guardar el dueño también en la mascota sería repetir el mismo dato dos veces.</w:t>
+      </w:r>
+    </w:p>
+    <w:p>
+      <w:pPr>
         <w:rPr>
           <w:rFonts w:ascii="Calibri" w:hAnsi="Calibri"/>
         </w:rPr>
-        <w:t xml:space="preserve">Modela el catálogo de servicios ofrecidos por la veterinaria (consulta general, cirugía, vacunación, etc.).</w:t>
-      </w:r>
-    </w:p>
-    <w:p>
-      <w:pPr>
-        <w:ind w:left="360" w:hanging="180"/>
-        <w:spacing w:after="60"/>
-      </w:pPr>
-      <w:r>
-        <w:rPr>
-          <w:rFonts w:ascii="Calibri" w:hAnsi="Calibri"/>
-        </w:rPr>
-        <w:t xml:space="preserve">• </w:t>
-      </w:r>
-      <w:r>
-        <w:rPr>
-          <w:rFonts w:ascii="Calibri" w:hAnsi="Calibri"/>
-          <w:b/>
-        </w:rPr>
-        <w:t xml:space="preserve">Requerimientos de habilitación: </w:t>
-      </w:r>
-      <w:r>
-        <w:rPr>
-          <w:rFonts w:ascii="Calibri" w:hAnsi="Calibri"/>
-        </w:rPr>
-        <w:t xml:space="preserve">Encapsula la lista de especialidades requeridas (List&lt;String&gt; especialidadRequerida) necesarias para prestar la atención.</w:t>
-      </w:r>
-    </w:p>
-    <w:p>
-      <w:pPr>
-        <w:ind w:left="360" w:hanging="180"/>
-        <w:spacing w:after="60"/>
-      </w:pPr>
-      <w:r>
-        <w:rPr>
-          <w:rFonts w:ascii="Calibri" w:hAnsi="Calibri"/>
-        </w:rPr>
-        <w:t xml:space="preserve">• </w:t>
-      </w:r>
-      <w:r>
-        <w:rPr>
-          <w:rFonts w:ascii="Calibri" w:hAnsi="Calibri"/>
-          <w:b/>
-        </w:rPr>
-        <w:t xml:space="preserve">Desacoplamiento de reglas: </w:t>
-      </w:r>
-      <w:r>
-        <w:rPr>
-          <w:rFonts w:ascii="Calibri" w:hAnsi="Calibri"/>
-        </w:rPr>
-        <w:t xml:space="preserve">Permite desacoplar el servicio de los profesionales específicos, funcionando como criterio de validación al momento de asignar un turno.</w:t>
-      </w:r>
-    </w:p>
-    <w:p>
-      <w:pPr>
-        <w:spacing w:before="160" w:after="60"/>
-      </w:pPr>
+      </w:pPr>
+    </w:p>
+    <w:p>
       <w:r>
         <w:rPr>
           <w:rFonts w:ascii="Calibri" w:hAnsi="Calibri"/>
@@ -4164,82 +4250,161 @@
           <w:i/>
           <w:sz w:val="22"/>
         </w:rPr>
-        <w:t xml:space="preserve">5. Turno</w:t>
-      </w:r>
-    </w:p>
-    <w:p>
-      <w:pPr>
-        <w:ind w:left="360" w:hanging="180"/>
-        <w:spacing w:after="60"/>
-      </w:pPr>
+        <w:t xml:space="preserve">4. Profesional</w:t>
+      </w:r>
+    </w:p>
+    <w:p>
       <w:r>
         <w:rPr>
           <w:rFonts w:ascii="Calibri" w:hAnsi="Calibri"/>
         </w:rPr>
-        <w:t xml:space="preserve">• </w:t>
-      </w:r>
+        <w:t xml:space="preserve">Cada profesional tiene una sola especialidad. Es lo más simple y alcanza para una veterinaria normal.</w:t>
+      </w:r>
+    </w:p>
+    <w:p>
+      <w:pPr>
+        <w:rPr>
+          <w:rFonts w:ascii="Calibri" w:hAnsi="Calibri"/>
+        </w:rPr>
+      </w:pPr>
+    </w:p>
+    <w:p>
       <w:r>
         <w:rPr>
           <w:rFonts w:ascii="Calibri" w:hAnsi="Calibri"/>
           <w:b/>
-        </w:rPr>
-        <w:t xml:space="preserve">Objeto asociativo central: </w:t>
-      </w:r>
+          <w:i/>
+          <w:sz w:val="22"/>
+        </w:rPr>
+        <w:t xml:space="preserve">5. Servicio</w:t>
+      </w:r>
+    </w:p>
+    <w:p>
       <w:r>
         <w:rPr>
           <w:rFonts w:ascii="Calibri" w:hAnsi="Calibri"/>
         </w:rPr>
-        <w:t xml:space="preserve">Materializa la reserva concreta de un horario determinado, vinculando a una Mascota, un Profesional y un Servicio solicitado.</w:t>
-      </w:r>
-    </w:p>
-    <w:p>
-      <w:pPr>
-        <w:ind w:left="360" w:hanging="180"/>
-        <w:spacing w:after="60"/>
-      </w:pPr>
+        <w:t xml:space="preserve">Un servicio guarda una lista de especialidades y no una sola, porque algunos servicios los pueden hacer profesionales de distintas especialidades. Por ejempl: poner una vacuna la puede poner un veterinario clínico o un especialista.</w:t>
+      </w:r>
+    </w:p>
+    <w:p>
       <w:r>
         <w:rPr>
           <w:rFonts w:ascii="Calibri" w:hAnsi="Calibri"/>
         </w:rPr>
-        <w:t xml:space="preserve">• </w:t>
-      </w:r>
+        <w:t xml:space="preserve">Un profesional puede hacer un servicio solo si su especialidad está en esa lista.</w:t>
+      </w:r>
+    </w:p>
+    <w:p>
+      <w:pPr>
+        <w:rPr>
+          <w:rFonts w:ascii="Calibri" w:hAnsi="Calibri"/>
+        </w:rPr>
+      </w:pPr>
+    </w:p>
+    <w:p>
       <w:r>
         <w:rPr>
           <w:rFonts w:ascii="Calibri" w:hAnsi="Calibri"/>
           <w:b/>
-        </w:rPr>
-        <w:t xml:space="preserve">Control de datos temporales: </w:t>
-      </w:r>
+          <w:i/>
+          <w:sz w:val="22"/>
+        </w:rPr>
+        <w:t xml:space="preserve">6. Las especialidades se escriben como texto</w:t>
+      </w:r>
+    </w:p>
+    <w:p>
       <w:r>
         <w:rPr>
           <w:rFonts w:ascii="Calibri" w:hAnsi="Calibri"/>
         </w:rPr>
-        <w:t xml:space="preserve">Registra y preserva la fecha y hora de la cita veterinaria.</w:t>
-      </w:r>
-    </w:p>
-    <w:p>
-      <w:pPr>
-        <w:ind w:left="360" w:hanging="180"/>
-        <w:spacing w:after="60"/>
-      </w:pPr>
+        <w:t xml:space="preserve">Por ahora las especialidades son texto.</w:t>
+      </w:r>
+    </w:p>
+    <w:p>
       <w:r>
         <w:rPr>
           <w:rFonts w:ascii="Calibri" w:hAnsi="Calibri"/>
         </w:rPr>
-        <w:t xml:space="preserve">• </w:t>
-      </w:r>
+        <w:t xml:space="preserve">El problema es que hay que escribirlas siempre igual, por ejemplo cuando escribis “Cirugía” y “Cirugia”  el programa las toma como distintas. Más adelante podríamos usar un enum, que de solo opciones. </w:t>
+      </w:r>
+    </w:p>
+    <w:p>
+      <w:pPr>
+        <w:rPr>
+          <w:rFonts w:ascii="Calibri" w:hAnsi="Calibri"/>
+        </w:rPr>
+      </w:pPr>
+    </w:p>
+    <w:p>
       <w:r>
         <w:rPr>
           <w:rFonts w:ascii="Calibri" w:hAnsi="Calibri"/>
           <w:b/>
-        </w:rPr>
-        <w:t xml:space="preserve">Gestión de ciclo de vida y estado: </w:t>
-      </w:r>
+          <w:i/>
+          <w:sz w:val="22"/>
+        </w:rPr>
+        <w:t xml:space="preserve">7. Turno: fecha y hora separadas</w:t>
+      </w:r>
+    </w:p>
+    <w:p>
       <w:r>
         <w:rPr>
           <w:rFonts w:ascii="Calibri" w:hAnsi="Calibri"/>
         </w:rPr>
-        <w:t xml:space="preserve">Controla si el turno se encuentra activo o cancelado (atributo boolean cancelado), permitiendo gestionar cancelaciones según los límites de tiempo de la veterinaria.</w:t>
+        <w:t xml:space="preserve">En el boceto el turno tenía un solo dato horario. Ahora tiene fecha y horario separados. Así es más fácil hacer dos cosas que necesitamos: ver si un profesional ya tiene un turno ese día a esa hora, y ver qué horarios le quedan libres en un día.</w:t>
+      </w:r>
+    </w:p>
+    <w:p>
+      <w:pPr>
+        <w:rPr>
+          <w:rFonts w:ascii="Calibri" w:hAnsi="Calibri"/>
+        </w:rPr>
+      </w:pPr>
+    </w:p>
+    <w:p>
+      <w:r>
+        <w:rPr>
+          <w:rFonts w:ascii="Calibri" w:hAnsi="Calibri"/>
+          <w:b/>
+          <w:i/>
+          <w:sz w:val="22"/>
+        </w:rPr>
+        <w:t xml:space="preserve">8. Los turnos cancelados no se borran</w:t>
+      </w:r>
+    </w:p>
+    <w:p>
+      <w:r>
+        <w:rPr>
+          <w:rFonts w:ascii="Calibri" w:hAnsi="Calibri"/>
+        </w:rPr>
+        <w:t xml:space="preserve">Cuando se cancela un turno no lo borramos, solo lo marcamos con cancelado. Así queda registrado que existió, pero el horario vuelve a quedar libre para otra mascota.</w:t>
+      </w:r>
+    </w:p>
+    <w:p>
+      <w:pPr>
+        <w:rPr>
+          <w:rFonts w:ascii="Calibri" w:hAnsi="Calibri"/>
+        </w:rPr>
+      </w:pPr>
+    </w:p>
+    <w:p>
+      <w:r>
+        <w:rPr>
+          <w:rFonts w:ascii="Calibri" w:hAnsi="Calibri"/>
+          <w:b/>
+          <w:i/>
+          <w:sz w:val="22"/>
+        </w:rPr>
+        <w:t xml:space="preserve">9. El turno guarda los objetos completos</w:t>
+      </w:r>
+    </w:p>
+    <w:p>
+      <w:r>
+        <w:rPr>
+          <w:rFonts w:ascii="Calibri" w:hAnsi="Calibri"/>
+        </w:rPr>
+        <w:t xml:space="preserve">El turno guarda la mascota, el profesional y el servicio completos, no solo sus números de id. Así, desde el turno se puede ver directamente la especialidad del profesional (turno.getProfesional().getEspecialidad()) sin tener que buscarlo en una lista.</w:t>
       </w:r>
     </w:p>
     <w:sectPr>

</xml_diff>

<commit_message>
Sprint 1: Agrega sección de responsabilidades de las clases al documento
</commit_message>
<xml_diff>
--- a/Sprint_0_TPI_Programacion_II.docx
+++ b/Sprint_0_TPI_Programacion_II.docx
@@ -4405,6 +4405,491 @@
           <w:rFonts w:ascii="Calibri" w:hAnsi="Calibri"/>
         </w:rPr>
         <w:t xml:space="preserve">El turno guarda la mascota, el profesional y el servicio completos, no solo sus números de id. Así, desde el turno se puede ver directamente la especialidad del profesional (turno.getProfesional().getEspecialidad()) sin tener que buscarlo en una lista.</w:t>
+      </w:r>
+    </w:p>
+    <w:p>
+      <w:pPr>
+        <w:rPr>
+          <w:rFonts w:ascii="Calibri" w:hAnsi="Calibri"/>
+        </w:rPr>
+      </w:pPr>
+    </w:p>
+    <w:p>
+      <w:pPr>
+        <w:pStyle w:val="Ttulo1"/>
+        <w:numPr>
+          <w:ilvl w:val="0"/>
+          <w:numId w:val="0"/>
+        </w:numPr>
+        <w:spacing w:before="280" w:after="80"/>
+        <w:jc w:val="left"/>
+        <w:rPr>
+          <w:b/>
+          <w:bCs/>
+        </w:rPr>
+      </w:pPr>
+      <w:r>
+        <w:rPr>
+          <w:rFonts w:ascii="Calibri" w:hAnsi="Calibri"/>
+          <w:b/>
+        </w:rPr>
+        <w:t xml:space="preserve">Responsabilidades de las clases</w:t>
+      </w:r>
+    </w:p>
+    <w:p>
+      <w:pPr>
+        <w:spacing w:after="80"/>
+      </w:pPr>
+      <w:r>
+        <w:rPr>
+          <w:rFonts w:ascii="Calibri" w:hAnsi="Calibri"/>
+        </w:rPr>
+        <w:t xml:space="preserve">Siguiendo el principio de Responsabilidad Única (SRP - Single Responsibility Principle) de la programación orientada a objetos, cada clase del sistema asume un conjunto delimitado y coherente de responsabilidades dentro del modelo de dominio:</w:t>
+      </w:r>
+    </w:p>
+    <w:p>
+      <w:pPr>
+        <w:spacing w:before="160" w:after="60"/>
+      </w:pPr>
+      <w:r>
+        <w:rPr>
+          <w:rFonts w:ascii="Calibri" w:hAnsi="Calibri"/>
+          <w:b/>
+          <w:i/>
+          <w:sz w:val="22"/>
+        </w:rPr>
+        <w:t xml:space="preserve">1. Cliente</w:t>
+      </w:r>
+    </w:p>
+    <w:p>
+      <w:pPr>
+        <w:ind w:left="360" w:hanging="180"/>
+        <w:spacing w:after="60"/>
+      </w:pPr>
+      <w:r>
+        <w:rPr>
+          <w:rFonts w:ascii="Calibri" w:hAnsi="Calibri"/>
+        </w:rPr>
+        <w:t xml:space="preserve">• </w:t>
+      </w:r>
+      <w:r>
+        <w:rPr>
+          <w:rFonts w:ascii="Calibri" w:hAnsi="Calibri"/>
+          <w:b/>
+        </w:rPr>
+        <w:t xml:space="preserve">Representación del titular: </w:t>
+      </w:r>
+      <w:r>
+        <w:rPr>
+          <w:rFonts w:ascii="Calibri" w:hAnsi="Calibri"/>
+        </w:rPr>
+        <w:t xml:space="preserve">Modela a la persona responsable y titular de contacto ante la clínica veterinaria (dueño de una o más mascotas).</w:t>
+      </w:r>
+    </w:p>
+    <w:p>
+      <w:pPr>
+        <w:ind w:left="360" w:hanging="180"/>
+        <w:spacing w:after="60"/>
+      </w:pPr>
+      <w:r>
+        <w:rPr>
+          <w:rFonts w:ascii="Calibri" w:hAnsi="Calibri"/>
+        </w:rPr>
+        <w:t xml:space="preserve">• </w:t>
+      </w:r>
+      <w:r>
+        <w:rPr>
+          <w:rFonts w:ascii="Calibri" w:hAnsi="Calibri"/>
+          <w:b/>
+        </w:rPr>
+        <w:t xml:space="preserve">Gestión de identidad y contacto: </w:t>
+      </w:r>
+      <w:r>
+        <w:rPr>
+          <w:rFonts w:ascii="Calibri" w:hAnsi="Calibri"/>
+        </w:rPr>
+        <w:t xml:space="preserve">Almacena y encapsula sus atributos personales (id, nombre, apellido, teléfono).</w:t>
+      </w:r>
+    </w:p>
+    <w:p>
+      <w:pPr>
+        <w:ind w:left="360" w:hanging="180"/>
+        <w:spacing w:after="60"/>
+      </w:pPr>
+      <w:r>
+        <w:rPr>
+          <w:rFonts w:ascii="Calibri" w:hAnsi="Calibri"/>
+        </w:rPr>
+        <w:t xml:space="preserve">• </w:t>
+      </w:r>
+      <w:r>
+        <w:rPr>
+          <w:rFonts w:ascii="Calibri" w:hAnsi="Calibri"/>
+          <w:b/>
+        </w:rPr>
+        <w:t xml:space="preserve">Administración de mascotas: </w:t>
+      </w:r>
+      <w:r>
+        <w:rPr>
+          <w:rFonts w:ascii="Calibri" w:hAnsi="Calibri"/>
+        </w:rPr>
+        <w:t xml:space="preserve">Mantiene la colección de mascotas a su cargo (List&lt;Mascota&gt;) y proporciona el método agregarMascota(Mascota) para incorporar nuevos animales sin delegar esta lógica a agentes externos.</w:t>
+      </w:r>
+    </w:p>
+    <w:p>
+      <w:pPr>
+        <w:spacing w:before="160" w:after="60"/>
+      </w:pPr>
+      <w:r>
+        <w:rPr>
+          <w:rFonts w:ascii="Calibri" w:hAnsi="Calibri"/>
+          <w:b/>
+          <w:i/>
+          <w:sz w:val="22"/>
+        </w:rPr>
+        <w:t xml:space="preserve">2. Mascota</w:t>
+      </w:r>
+    </w:p>
+    <w:p>
+      <w:pPr>
+        <w:ind w:left="360" w:hanging="180"/>
+        <w:spacing w:after="60"/>
+      </w:pPr>
+      <w:r>
+        <w:rPr>
+          <w:rFonts w:ascii="Calibri" w:hAnsi="Calibri"/>
+        </w:rPr>
+        <w:t xml:space="preserve">• </w:t>
+      </w:r>
+      <w:r>
+        <w:rPr>
+          <w:rFonts w:ascii="Calibri" w:hAnsi="Calibri"/>
+          <w:b/>
+        </w:rPr>
+        <w:t xml:space="preserve">Representación del paciente: </w:t>
+      </w:r>
+      <w:r>
+        <w:rPr>
+          <w:rFonts w:ascii="Calibri" w:hAnsi="Calibri"/>
+        </w:rPr>
+        <w:t xml:space="preserve">Modela al animal que recibe los cuidados médicos y servicios dentro de la veterinaria.</w:t>
+      </w:r>
+    </w:p>
+    <w:p>
+      <w:pPr>
+        <w:ind w:left="360" w:hanging="180"/>
+        <w:spacing w:after="60"/>
+      </w:pPr>
+      <w:r>
+        <w:rPr>
+          <w:rFonts w:ascii="Calibri" w:hAnsi="Calibri"/>
+        </w:rPr>
+        <w:t xml:space="preserve">• </w:t>
+      </w:r>
+      <w:r>
+        <w:rPr>
+          <w:rFonts w:ascii="Calibri" w:hAnsi="Calibri"/>
+          <w:b/>
+        </w:rPr>
+        <w:t xml:space="preserve">Encapsulamiento biológico: </w:t>
+      </w:r>
+      <w:r>
+        <w:rPr>
+          <w:rFonts w:ascii="Calibri" w:hAnsi="Calibri"/>
+        </w:rPr>
+        <w:t xml:space="preserve">Resguarda la identidad y características del animal (id, nombre, especie, raza).</w:t>
+      </w:r>
+    </w:p>
+    <w:p>
+      <w:pPr>
+        <w:ind w:left="360" w:hanging="180"/>
+        <w:spacing w:after="60"/>
+      </w:pPr>
+      <w:r>
+        <w:rPr>
+          <w:rFonts w:ascii="Calibri" w:hAnsi="Calibri"/>
+        </w:rPr>
+        <w:t xml:space="preserve">• </w:t>
+      </w:r>
+      <w:r>
+        <w:rPr>
+          <w:rFonts w:ascii="Calibri" w:hAnsi="Calibri"/>
+          <w:b/>
+        </w:rPr>
+        <w:t xml:space="preserve">Entidad individual de turnos: </w:t>
+      </w:r>
+      <w:r>
+        <w:rPr>
+          <w:rFonts w:ascii="Calibri" w:hAnsi="Calibri"/>
+        </w:rPr>
+        <w:t xml:space="preserve">Funciona como el sujeto central e individual sobre el cual se agendan los turnos, respetando la regla de negocio de que cada turno corresponde a una única mascota.</w:t>
+      </w:r>
+    </w:p>
+    <w:p>
+      <w:pPr>
+        <w:spacing w:before="160" w:after="60"/>
+      </w:pPr>
+      <w:r>
+        <w:rPr>
+          <w:rFonts w:ascii="Calibri" w:hAnsi="Calibri"/>
+          <w:b/>
+          <w:i/>
+          <w:sz w:val="22"/>
+        </w:rPr>
+        <w:t xml:space="preserve">3. Profesional</w:t>
+      </w:r>
+    </w:p>
+    <w:p>
+      <w:pPr>
+        <w:ind w:left="360" w:hanging="180"/>
+        <w:spacing w:after="60"/>
+      </w:pPr>
+      <w:r>
+        <w:rPr>
+          <w:rFonts w:ascii="Calibri" w:hAnsi="Calibri"/>
+        </w:rPr>
+        <w:t xml:space="preserve">• </w:t>
+      </w:r>
+      <w:r>
+        <w:rPr>
+          <w:rFonts w:ascii="Calibri" w:hAnsi="Calibri"/>
+          <w:b/>
+        </w:rPr>
+        <w:t xml:space="preserve">Representación del personal médico: </w:t>
+      </w:r>
+      <w:r>
+        <w:rPr>
+          <w:rFonts w:ascii="Calibri" w:hAnsi="Calibri"/>
+        </w:rPr>
+        <w:t xml:space="preserve">Modela al veterinario o especialista habilitado para prestar los servicios de la clínica.</w:t>
+      </w:r>
+    </w:p>
+    <w:p>
+      <w:pPr>
+        <w:ind w:left="360" w:hanging="180"/>
+        <w:spacing w:after="60"/>
+      </w:pPr>
+      <w:r>
+        <w:rPr>
+          <w:rFonts w:ascii="Calibri" w:hAnsi="Calibri"/>
+        </w:rPr>
+        <w:t xml:space="preserve">• </w:t>
+      </w:r>
+      <w:r>
+        <w:rPr>
+          <w:rFonts w:ascii="Calibri" w:hAnsi="Calibri"/>
+          <w:b/>
+        </w:rPr>
+        <w:t xml:space="preserve">Identificación y especialidad: </w:t>
+      </w:r>
+      <w:r>
+        <w:rPr>
+          <w:rFonts w:ascii="Calibri" w:hAnsi="Calibri"/>
+        </w:rPr>
+        <w:t xml:space="preserve">Encapsula su número de matrícula profesional, sus datos de contacto (teléfono, correo) y su especialidad médica correspondiente.</w:t>
+      </w:r>
+    </w:p>
+    <w:p>
+      <w:pPr>
+        <w:ind w:left="360" w:hanging="180"/>
+        <w:spacing w:after="60"/>
+      </w:pPr>
+      <w:r>
+        <w:rPr>
+          <w:rFonts w:ascii="Calibri" w:hAnsi="Calibri"/>
+        </w:rPr>
+        <w:t xml:space="preserve">• </w:t>
+      </w:r>
+      <w:r>
+        <w:rPr>
+          <w:rFonts w:ascii="Calibri" w:hAnsi="Calibri"/>
+          <w:b/>
+        </w:rPr>
+        <w:t xml:space="preserve">Validación de atención y disponibilidad: </w:t>
+      </w:r>
+      <w:r>
+        <w:rPr>
+          <w:rFonts w:ascii="Calibri" w:hAnsi="Calibri"/>
+        </w:rPr>
+        <w:t xml:space="preserve">Provee la información esencial para contrastar su especialidad frente a los servicios solicitados y controlar que no existan superposiciones horarias en su agenda.</w:t>
+      </w:r>
+    </w:p>
+    <w:p>
+      <w:pPr>
+        <w:spacing w:before="160" w:after="60"/>
+      </w:pPr>
+      <w:r>
+        <w:rPr>
+          <w:rFonts w:ascii="Calibri" w:hAnsi="Calibri"/>
+          <w:b/>
+          <w:i/>
+          <w:sz w:val="22"/>
+        </w:rPr>
+        <w:t xml:space="preserve">4. Servicio</w:t>
+      </w:r>
+    </w:p>
+    <w:p>
+      <w:pPr>
+        <w:ind w:left="360" w:hanging="180"/>
+        <w:spacing w:after="60"/>
+      </w:pPr>
+      <w:r>
+        <w:rPr>
+          <w:rFonts w:ascii="Calibri" w:hAnsi="Calibri"/>
+        </w:rPr>
+        <w:t xml:space="preserve">• </w:t>
+      </w:r>
+      <w:r>
+        <w:rPr>
+          <w:rFonts w:ascii="Calibri" w:hAnsi="Calibri"/>
+          <w:b/>
+        </w:rPr>
+        <w:t xml:space="preserve">Tipificación de prestaciones: </w:t>
+      </w:r>
+      <w:r>
+        <w:rPr>
+          <w:rFonts w:ascii="Calibri" w:hAnsi="Calibri"/>
+        </w:rPr>
+        <w:t xml:space="preserve">Modela el catálogo de servicios ofrecidos por la veterinaria (consulta general, cirugía, vacunación, etc.).</w:t>
+      </w:r>
+    </w:p>
+    <w:p>
+      <w:pPr>
+        <w:ind w:left="360" w:hanging="180"/>
+        <w:spacing w:after="60"/>
+      </w:pPr>
+      <w:r>
+        <w:rPr>
+          <w:rFonts w:ascii="Calibri" w:hAnsi="Calibri"/>
+        </w:rPr>
+        <w:t xml:space="preserve">• </w:t>
+      </w:r>
+      <w:r>
+        <w:rPr>
+          <w:rFonts w:ascii="Calibri" w:hAnsi="Calibri"/>
+          <w:b/>
+        </w:rPr>
+        <w:t xml:space="preserve">Requerimientos de habilitación: </w:t>
+      </w:r>
+      <w:r>
+        <w:rPr>
+          <w:rFonts w:ascii="Calibri" w:hAnsi="Calibri"/>
+        </w:rPr>
+        <w:t xml:space="preserve">Encapsula la lista de especialidades requeridas (List&lt;String&gt; especialidadRequerida) necesarias para prestar la atención.</w:t>
+      </w:r>
+    </w:p>
+    <w:p>
+      <w:pPr>
+        <w:ind w:left="360" w:hanging="180"/>
+        <w:spacing w:after="60"/>
+      </w:pPr>
+      <w:r>
+        <w:rPr>
+          <w:rFonts w:ascii="Calibri" w:hAnsi="Calibri"/>
+        </w:rPr>
+        <w:t xml:space="preserve">• </w:t>
+      </w:r>
+      <w:r>
+        <w:rPr>
+          <w:rFonts w:ascii="Calibri" w:hAnsi="Calibri"/>
+          <w:b/>
+        </w:rPr>
+        <w:t xml:space="preserve">Desacoplamiento de reglas: </w:t>
+      </w:r>
+      <w:r>
+        <w:rPr>
+          <w:rFonts w:ascii="Calibri" w:hAnsi="Calibri"/>
+        </w:rPr>
+        <w:t xml:space="preserve">Permite desacoplar el servicio de los profesionales específicos, funcionando como criterio de validación al momento de asignar un turno.</w:t>
+      </w:r>
+    </w:p>
+    <w:p>
+      <w:pPr>
+        <w:spacing w:before="160" w:after="60"/>
+      </w:pPr>
+      <w:r>
+        <w:rPr>
+          <w:rFonts w:ascii="Calibri" w:hAnsi="Calibri"/>
+          <w:b/>
+          <w:i/>
+          <w:sz w:val="22"/>
+        </w:rPr>
+        <w:t xml:space="preserve">5. Turno</w:t>
+      </w:r>
+    </w:p>
+    <w:p>
+      <w:pPr>
+        <w:ind w:left="360" w:hanging="180"/>
+        <w:spacing w:after="60"/>
+      </w:pPr>
+      <w:r>
+        <w:rPr>
+          <w:rFonts w:ascii="Calibri" w:hAnsi="Calibri"/>
+        </w:rPr>
+        <w:t xml:space="preserve">• </w:t>
+      </w:r>
+      <w:r>
+        <w:rPr>
+          <w:rFonts w:ascii="Calibri" w:hAnsi="Calibri"/>
+          <w:b/>
+        </w:rPr>
+        <w:t xml:space="preserve">Objeto asociativo central: </w:t>
+      </w:r>
+      <w:r>
+        <w:rPr>
+          <w:rFonts w:ascii="Calibri" w:hAnsi="Calibri"/>
+        </w:rPr>
+        <w:t xml:space="preserve">Materializa la reserva concreta de un horario determinado, vinculando a una Mascota, un Profesional y un Servicio solicitado.</w:t>
+      </w:r>
+    </w:p>
+    <w:p>
+      <w:pPr>
+        <w:ind w:left="360" w:hanging="180"/>
+        <w:spacing w:after="60"/>
+      </w:pPr>
+      <w:r>
+        <w:rPr>
+          <w:rFonts w:ascii="Calibri" w:hAnsi="Calibri"/>
+        </w:rPr>
+        <w:t xml:space="preserve">• </w:t>
+      </w:r>
+      <w:r>
+        <w:rPr>
+          <w:rFonts w:ascii="Calibri" w:hAnsi="Calibri"/>
+          <w:b/>
+        </w:rPr>
+        <w:t xml:space="preserve">Control de datos temporales: </w:t>
+      </w:r>
+      <w:r>
+        <w:rPr>
+          <w:rFonts w:ascii="Calibri" w:hAnsi="Calibri"/>
+        </w:rPr>
+        <w:t xml:space="preserve">Registra y preserva la fecha y hora de la cita veterinaria.</w:t>
+      </w:r>
+    </w:p>
+    <w:p>
+      <w:pPr>
+        <w:ind w:left="360" w:hanging="180"/>
+        <w:spacing w:after="60"/>
+      </w:pPr>
+      <w:r>
+        <w:rPr>
+          <w:rFonts w:ascii="Calibri" w:hAnsi="Calibri"/>
+        </w:rPr>
+        <w:t xml:space="preserve">• </w:t>
+      </w:r>
+      <w:r>
+        <w:rPr>
+          <w:rFonts w:ascii="Calibri" w:hAnsi="Calibri"/>
+          <w:b/>
+        </w:rPr>
+        <w:t xml:space="preserve">Gestión de ciclo de vida y estado: </w:t>
+      </w:r>
+      <w:r>
+        <w:rPr>
+          <w:rFonts w:ascii="Calibri" w:hAnsi="Calibri"/>
+        </w:rPr>
+        <w:t xml:space="preserve">Controla si el turno se encuentra activo o cancelado (atributo boolean cancelado), permitiendo gestionar cancelaciones según los límites de tiempo de la veterinaria.</w:t>
       </w:r>
     </w:p>
     <w:sectPr>

</xml_diff>